<commit_message>
feat: unifies management styles and forms, and updates documentation
</commit_message>
<xml_diff>
--- a/Documentos/Documentación/Acta Constitución Proyecto.docx
+++ b/Documentos/Documentación/Acta Constitución Proyecto.docx
@@ -221,57 +221,6 @@
     <w:p>
       <w:pPr>
         <w:spacing w:after="0" w:line="240" w:lineRule="auto"/>
-        <w:jc w:val="right"/>
-        <w:rPr>
-          <w:rFonts w:ascii="Calibri" w:eastAsia="Calibri" w:hAnsi="Calibri" w:cs="Calibri"/>
-          <w:b/>
-          <w:bCs/>
-          <w:i/>
-          <w:iCs/>
-          <w:color w:val="365F91"/>
-          <w:sz w:val="36"/>
-          <w:szCs w:val="36"/>
-        </w:rPr>
-      </w:pPr>
-      <w:r>
-        <w:rPr>
-          <w:b/>
-          <w:bCs/>
-          <w:i/>
-          <w:iCs/>
-          <w:sz w:val="36"/>
-          <w:szCs w:val="36"/>
-        </w:rPr>
-        <w:t>Fecha:</w:t>
-      </w:r>
-      <w:r>
-        <w:rPr>
-          <w:b/>
-          <w:bCs/>
-          <w:i/>
-          <w:iCs/>
-          <w:color w:val="365F91"/>
-          <w:sz w:val="36"/>
-          <w:szCs w:val="36"/>
-        </w:rPr>
-        <w:t xml:space="preserve"> </w:t>
-      </w:r>
-      <w:r>
-        <w:rPr>
-          <w:b/>
-          <w:bCs/>
-          <w:i/>
-          <w:iCs/>
-          <w:color w:val="00B050"/>
-          <w:sz w:val="36"/>
-          <w:szCs w:val="36"/>
-        </w:rPr>
-        <w:t>24/03/2026</w:t>
-      </w:r>
-    </w:p>
-    <w:p>
-      <w:pPr>
-        <w:spacing w:after="0" w:line="240" w:lineRule="auto"/>
         <w:rPr>
           <w:b/>
           <w:bCs/>
@@ -508,6 +457,7 @@
           <w:sz w:val="32"/>
           <w:szCs w:val="32"/>
         </w:rPr>
+        <w:lastRenderedPageBreak/>
         <w:t>Tabla de contenido</w:t>
       </w:r>
     </w:p>
@@ -1229,7 +1179,21 @@
             <w:rPr>
               <w:color w:val="000000"/>
             </w:rPr>
-            <w:t>Lista de Interesados (stakeholders)</w:t>
+            <w:t>Lista de Interesados (</w:t>
+          </w:r>
+          <w:proofErr w:type="spellStart"/>
+          <w:r>
+            <w:rPr>
+              <w:color w:val="000000"/>
+            </w:rPr>
+            <w:t>stakeholders</w:t>
+          </w:r>
+          <w:proofErr w:type="spellEnd"/>
+          <w:r>
+            <w:rPr>
+              <w:color w:val="000000"/>
+            </w:rPr>
+            <w:t>)</w:t>
           </w:r>
           <w:r>
             <w:rPr>
@@ -2122,12 +2086,21 @@
                 <w:color w:val="000000"/>
               </w:rPr>
             </w:pPr>
-            <w:r>
-              <w:rPr>
-                <w:b/>
-                <w:bCs/>
-              </w:rPr>
-              <w:t>Victor Garay</w:t>
+            <w:proofErr w:type="spellStart"/>
+            <w:r>
+              <w:rPr>
+                <w:b/>
+                <w:bCs/>
+              </w:rPr>
+              <w:t>Victor</w:t>
+            </w:r>
+            <w:proofErr w:type="spellEnd"/>
+            <w:r>
+              <w:rPr>
+                <w:b/>
+                <w:bCs/>
+              </w:rPr>
+              <w:t xml:space="preserve"> Garay</w:t>
             </w:r>
           </w:p>
         </w:tc>
@@ -2692,6 +2665,24 @@
               </w:rPr>
               <w:t>El proyecto consiste en desarrollar una aplicación web que funcione como biblioteca. El objetivo de esta aplicación es fomentar la educación y cultura en nuestra sociedad, dar un espacio a las personas para que compartan sus libros o textos de cualquier tipo, se busca dar libertad al usuario para que publique lo que desee según las condiciones establecidas por la empresa.</w:t>
             </w:r>
+            <w:r>
+              <w:rPr>
+                <w:rFonts w:ascii="Calibri" w:eastAsia="Calibri" w:hAnsi="Calibri" w:cs="Calibri"/>
+              </w:rPr>
+              <w:t xml:space="preserve"> </w:t>
+            </w:r>
+            <w:r>
+              <w:rPr>
+                <w:rFonts w:ascii="Calibri" w:eastAsia="Calibri" w:hAnsi="Calibri" w:cs="Calibri"/>
+              </w:rPr>
+              <w:t>Además,</w:t>
+            </w:r>
+            <w:r>
+              <w:rPr>
+                <w:rFonts w:ascii="Calibri" w:eastAsia="Calibri" w:hAnsi="Calibri" w:cs="Calibri"/>
+              </w:rPr>
+              <w:t xml:space="preserve"> contará con un sistema de venta tipo librería.</w:t>
+            </w:r>
           </w:p>
           <w:p>
             <w:pPr>
@@ -2704,7 +2695,21 @@
               <w:rPr>
                 <w:rFonts w:ascii="Calibri" w:eastAsia="Calibri" w:hAnsi="Calibri" w:cs="Calibri"/>
               </w:rPr>
-              <w:t xml:space="preserve">La aplicación contará con herramientas modernas y actualizadas diferenciándose del resto de apps tipo bibliotecas que poseen funciones más limitadas, por lo que resolvería </w:t>
+              <w:t xml:space="preserve">La aplicación contará con herramientas modernas y actualizadas diferenciándose del resto de </w:t>
+            </w:r>
+            <w:proofErr w:type="gramStart"/>
+            <w:r>
+              <w:rPr>
+                <w:rFonts w:ascii="Calibri" w:eastAsia="Calibri" w:hAnsi="Calibri" w:cs="Calibri"/>
+              </w:rPr>
+              <w:t>apps</w:t>
+            </w:r>
+            <w:proofErr w:type="gramEnd"/>
+            <w:r>
+              <w:rPr>
+                <w:rFonts w:ascii="Calibri" w:eastAsia="Calibri" w:hAnsi="Calibri" w:cs="Calibri"/>
+              </w:rPr>
+              <w:t xml:space="preserve"> tipo bibliotecas que poseen funciones más limitadas, por lo que resolvería </w:t>
             </w:r>
             <w:r>
               <w:rPr>
@@ -2725,7 +2730,21 @@
               <w:rPr>
                 <w:rFonts w:ascii="Calibri" w:eastAsia="Calibri" w:hAnsi="Calibri" w:cs="Calibri"/>
               </w:rPr>
-              <w:t>La app está pensada para ser utilizada por cualquier persona sin importar la edad, por lo que será intuitiva y fácil de utilizar.</w:t>
+              <w:t xml:space="preserve">La </w:t>
+            </w:r>
+            <w:proofErr w:type="gramStart"/>
+            <w:r>
+              <w:rPr>
+                <w:rFonts w:ascii="Calibri" w:eastAsia="Calibri" w:hAnsi="Calibri" w:cs="Calibri"/>
+              </w:rPr>
+              <w:t>app</w:t>
+            </w:r>
+            <w:proofErr w:type="gramEnd"/>
+            <w:r>
+              <w:rPr>
+                <w:rFonts w:ascii="Calibri" w:eastAsia="Calibri" w:hAnsi="Calibri" w:cs="Calibri"/>
+              </w:rPr>
+              <w:t xml:space="preserve"> está pensada para ser utilizada por cualquier persona sin importar la edad, por lo que será intuitiva y fácil de utilizar.</w:t>
             </w:r>
           </w:p>
           <w:p>
@@ -3029,7 +3048,19 @@
               <w:rPr>
                 <w:rFonts w:ascii="Calibri" w:eastAsia="Calibri" w:hAnsi="Calibri" w:cs="Calibri"/>
               </w:rPr>
-              <w:t>Se construirá un producto basado en los requerimientos establecidos, cubriendo los puntos más importantes, como: publicación de libros, geolocalización de bibliotecas y asistente IA.</w:t>
+              <w:t>Se construirá un producto basado en los requerimientos establecidos, cubriendo los puntos más importantes, como: publicación de libros, geolocalización de bibliotecas</w:t>
+            </w:r>
+            <w:r>
+              <w:rPr>
+                <w:rFonts w:ascii="Calibri" w:eastAsia="Calibri" w:hAnsi="Calibri" w:cs="Calibri"/>
+              </w:rPr>
+              <w:t>, sistema de ventas, reseñas</w:t>
+            </w:r>
+            <w:r>
+              <w:rPr>
+                <w:rFonts w:ascii="Calibri" w:eastAsia="Calibri" w:hAnsi="Calibri" w:cs="Calibri"/>
+              </w:rPr>
+              <w:t xml:space="preserve"> y asistente IA.</w:t>
             </w:r>
           </w:p>
           <w:p>
@@ -3321,7 +3352,7 @@
               <w:rPr>
                 <w:rFonts w:ascii="Calibri" w:eastAsia="Calibri" w:hAnsi="Calibri" w:cs="Calibri"/>
               </w:rPr>
-              <w:t>1.4 La mantención y control de la aplicación será mediante un perfil de administrador, el cual permite el acceso a la información completa de libros, además de poder acceder a la información de usuarios registrados ya sean lectores o trabajadores.</w:t>
+              <w:t>1.4 La mantención y control de la aplicación será mediante un perfil de administrador, el cual permite el acceso a la información completa de libros, además de poder acceder a la información de usuarios registrados.</w:t>
             </w:r>
           </w:p>
           <w:p>
@@ -3351,7 +3382,7 @@
               <w:rPr>
                 <w:rFonts w:ascii="Calibri" w:eastAsia="Calibri" w:hAnsi="Calibri" w:cs="Calibri"/>
               </w:rPr>
-              <w:t>1.5 Toda esta información estará almacenada en una base de datos.</w:t>
+              <w:t>1.5 Toda esta información estará almacenada en base de datos.</w:t>
             </w:r>
           </w:p>
           <w:p>
@@ -4826,7 +4857,39 @@
           <w:sz w:val="32"/>
           <w:szCs w:val="32"/>
         </w:rPr>
-        <w:t>Lista de Interesados (stakeholders)</w:t>
+        <w:t>Lista de Interesados (</w:t>
+      </w:r>
+      <w:proofErr w:type="spellStart"/>
+      <w:r>
+        <w:rPr>
+          <w:b/>
+          <w:bCs/>
+          <w:color w:val="365F91"/>
+          <w:sz w:val="32"/>
+          <w:szCs w:val="32"/>
+        </w:rPr>
+        <w:t>S</w:t>
+      </w:r>
+      <w:r>
+        <w:rPr>
+          <w:b/>
+          <w:bCs/>
+          <w:color w:val="365F91"/>
+          <w:sz w:val="32"/>
+          <w:szCs w:val="32"/>
+        </w:rPr>
+        <w:t>takeholders</w:t>
+      </w:r>
+      <w:proofErr w:type="spellEnd"/>
+      <w:r>
+        <w:rPr>
+          <w:b/>
+          <w:bCs/>
+          <w:color w:val="365F91"/>
+          <w:sz w:val="32"/>
+          <w:szCs w:val="32"/>
+        </w:rPr>
+        <w:t>)</w:t>
       </w:r>
     </w:p>
     <w:tbl>
@@ -5259,7 +5322,19 @@
               <w:rPr>
                 <w:rFonts w:ascii="Calibri" w:eastAsia="Calibri" w:hAnsi="Calibri" w:cs="Calibri"/>
               </w:rPr>
-              <w:t>Que se garantice que se cumplan los acuerdos y condiciones entre los usuarios y la municipalidad.</w:t>
+              <w:t xml:space="preserve">Que se garantice que se cumplan los acuerdos y condiciones entre los usuarios y </w:t>
+            </w:r>
+            <w:r>
+              <w:rPr>
+                <w:rFonts w:ascii="Calibri" w:eastAsia="Calibri" w:hAnsi="Calibri" w:cs="Calibri"/>
+              </w:rPr>
+              <w:t>el cliente</w:t>
+            </w:r>
+            <w:r>
+              <w:rPr>
+                <w:rFonts w:ascii="Calibri" w:eastAsia="Calibri" w:hAnsi="Calibri" w:cs="Calibri"/>
+              </w:rPr>
+              <w:t>.</w:t>
             </w:r>
           </w:p>
           <w:p>
@@ -5753,7 +5828,21 @@
               <w:rPr>
                 <w:color w:val="000000"/>
               </w:rPr>
-              <w:t>Decisiones de personal (Staffing)</w:t>
+              <w:t>Decisiones de personal (</w:t>
+            </w:r>
+            <w:proofErr w:type="spellStart"/>
+            <w:r>
+              <w:rPr>
+                <w:color w:val="000000"/>
+              </w:rPr>
+              <w:t>Staffing</w:t>
+            </w:r>
+            <w:proofErr w:type="spellEnd"/>
+            <w:r>
+              <w:rPr>
+                <w:color w:val="000000"/>
+              </w:rPr>
+              <w:t>)</w:t>
             </w:r>
           </w:p>
         </w:tc>

</xml_diff>